<commit_message>
Add confirmed Next.js SSR, SCSS, and form skills to the frontend CV.
Co-authored-by: Mohamed Mostafa <dev.xmuhameed@gmail.com>
</commit_message>
<xml_diff>
--- a/Mohamed_Mostafa-Frontend_Developer.docx
+++ b/Mohamed_Mostafa-Frontend_Developer.docx
@@ -93,7 +93,7 @@
           <w:sz w:val="22"/>
           <w:u w:val="none"/>
         </w:rPr>
-        <w:t>Front-End Developer with 4+ years of experience building responsive front end web applications with React.js, Next.js, TypeScript, JavaScript (ES6+), Tailwind CSS, Redux Toolkit, and Zustand. Builds reusable user interface (UI) components in HTML and CSS, integrates REST (Representational State Transfer) application programming interfaces (APIs), and turns business requirements into interfaces for enterprise and e-commerce products. Improved Core Web Vitals and search engine optimization (SEO), cutting page load times by up to 25% and increasing organic traffic by 20%. Works with cross-functional teams in Agile environments.</w:t>
+        <w:t>Front-End Developer with 4+ years of experience building responsive front end web applications with React.js, Next.js, and TypeScript, including server-side rendering (SSR) and the App Router. Builds reusable user interface (UI) components with Tailwind CSS and SCSS (Sass), and forms with React Hook Form and Zod. Integrates REST (Representational State Transfer) application programming interfaces (APIs) for enterprise and e-commerce products. Improved Core Web Vitals and search engine optimization (SEO), cutting page load times by up to 25% and increasing organic traffic by 20%. Works with cross-functional Agile teams.</w:t>
       </w:r>
     </w:p>
     <w:p>
@@ -173,7 +173,7 @@
           <w:sz w:val="22"/>
           <w:u w:val="none"/>
         </w:rPr>
-        <w:t>React.js, Next.js, Tailwind CSS, Redux Toolkit and Zustand for state management, Bootstrap, Three.js, responsive web design (HTML and CSS)</w:t>
+        <w:t>React.js, Next.js (server-side rendering (SSR) and App Router), Tailwind CSS, SCSS (Sass), React Hook Form, Zod, Redux Toolkit and Zustand for state management, Bootstrap, Three.js, responsive web design (HTML and CSS)</w:t>
       </w:r>
     </w:p>
     <w:p>
@@ -202,7 +202,7 @@
           <w:sz w:val="22"/>
           <w:u w:val="none"/>
         </w:rPr>
-        <w:t>Node.js, NestJS (Nest.js), Express.js, REST APIs, Prisma ORM (object-relational mapping), secure JSON Web Token (JWT) authentication and authorization</w:t>
+        <w:t>Node.js, NestJS (Nest.js), Express.js, REST APIs, WebSockets (Socket.io), Prisma ORM (object-relational mapping), secure JSON Web Token (JWT) authentication and authorization</w:t>
       </w:r>
     </w:p>
     <w:p>
@@ -260,7 +260,7 @@
           <w:sz w:val="22"/>
           <w:u w:val="none"/>
         </w:rPr>
-        <w:t>Git, GitHub (version control), CI/CD (continuous integration and continuous delivery) with GitHub Actions, Postman, Figma, Stripe, Tabby, Google Analytics, Meta Pixel, Agile</w:t>
+        <w:t>Git, GitHub (version control), CI/CD (continuous integration and continuous delivery) with GitHub Actions, Vercel, Postman, Figma, Stripe, Tabby, Google Analytics, Meta Pixel, Agile</w:t>
       </w:r>
     </w:p>
     <w:p>
@@ -550,7 +550,7 @@
           <w:sz w:val="22"/>
           <w:u w:val="none"/>
         </w:rPr>
-        <w:t>• Built real-time dashboards with NestJS and optimized backend performance for PostgreSQL enterprise systems.</w:t>
+        <w:t>• Built real-time dashboards with NestJS and WebSockets (Socket.io), and optimized backend performance for PostgreSQL enterprise systems.</w:t>
       </w:r>
     </w:p>
     <w:p>

</xml_diff>